<commit_message>
Update ATS resume to single page
</commit_message>
<xml_diff>
--- a/Resume-Jack-Hagler-ATS.docx
+++ b/Resume-Jack-Hagler-ATS.docx
@@ -4,38 +4,34 @@
   <w:body>
     <w:p>
       <w:pPr>
-        <w:spacing w:before="0" w:after="0" w:line="240" w:lineRule="auto"/>
+        <w:spacing w:after="20"/>
         <w:jc w:val="center"/>
       </w:pPr>
       <w:r>
         <w:rPr>
           <w:rFonts w:ascii="Calibri" w:hAnsi="Calibri"/>
           <w:b/>
-          <w:color w:val="000000"/>
-          <w:sz w:val="40"/>
+          <w:sz w:val="32"/>
         </w:rPr>
         <w:t>Jack Harbeson Hagler</w:t>
       </w:r>
     </w:p>
     <w:p>
       <w:pPr>
-        <w:spacing w:before="0" w:after="120" w:line="240" w:lineRule="auto"/>
+        <w:spacing w:after="40"/>
         <w:jc w:val="center"/>
       </w:pPr>
       <w:r>
         <w:rPr>
           <w:rFonts w:ascii="Calibri" w:hAnsi="Calibri"/>
-          <w:b w:val="0"/>
-          <w:color w:val="000000"/>
-          <w:sz w:val="20"/>
+          <w:sz w:val="18"/>
         </w:rPr>
         <w:t>Columbus, GA | (470) 230-3985 | jackhagler14@gmail.com | jackhagler.com | linkedin.com/in/jackharbesonhag</w:t>
       </w:r>
     </w:p>
     <w:p>
       <w:pPr>
-        <w:spacing w:before="120" w:after="80" w:line="240" w:lineRule="auto"/>
-        <w:jc w:val="left"/>
+        <w:spacing w:before="80" w:after="20"/>
         <w:pBdr>
           <w:bottom w:val="single" w:sz="4" w:space="1" w:color="000000"/>
         </w:pBdr>
@@ -44,31 +40,27 @@
         <w:rPr>
           <w:rFonts w:ascii="Calibri" w:hAnsi="Calibri"/>
           <w:b/>
-          <w:color w:val="000000"/>
-          <w:sz w:val="26"/>
+          <w:sz w:val="21"/>
         </w:rPr>
         <w:t>PROFESSIONAL SUMMARY</w:t>
       </w:r>
     </w:p>
     <w:p>
       <w:pPr>
-        <w:spacing w:before="0" w:after="120" w:line="240" w:lineRule="auto"/>
-        <w:jc w:val="left"/>
+        <w:spacing w:after="20"/>
       </w:pPr>
       <w:r>
         <w:rPr>
           <w:rFonts w:ascii="Calibri" w:hAnsi="Calibri"/>
           <w:b w:val="0"/>
-          <w:color w:val="000000"/>
-          <w:sz w:val="22"/>
+          <w:sz w:val="18"/>
         </w:rPr>
         <w:t>Results-driven Project Coordinator with 5+ years managing 750+ accounts across seven states for a $750M corporation. Proven expertise in project management, CRM operations (Microsoft Dynamics, TaxDome), data analysis (Tableau, Excel Pivot Tables), and cross-functional stakeholder communication. Skilled in vendor coordination, budget reconciliation, digital transformation, and client success management.</w:t>
       </w:r>
     </w:p>
     <w:p>
       <w:pPr>
-        <w:spacing w:before="160" w:after="80" w:line="240" w:lineRule="auto"/>
-        <w:jc w:val="left"/>
+        <w:spacing w:before="80" w:after="20"/>
         <w:pBdr>
           <w:bottom w:val="single" w:sz="4" w:space="1" w:color="000000"/>
         </w:pBdr>
@@ -77,428 +69,321 @@
         <w:rPr>
           <w:rFonts w:ascii="Calibri" w:hAnsi="Calibri"/>
           <w:b/>
-          <w:color w:val="000000"/>
-          <w:sz w:val="26"/>
+          <w:sz w:val="21"/>
         </w:rPr>
         <w:t>EXPERIENCE</w:t>
       </w:r>
     </w:p>
     <w:p>
       <w:pPr>
-        <w:spacing w:before="80" w:after="0" w:line="240" w:lineRule="auto"/>
         <w:tabs>
-          <w:tab w:val="right" w:pos="10512"/>
+          <w:tab w:pos="10800" w:val="right"/>
         </w:tabs>
+        <w:spacing w:before="60" w:after="0"/>
       </w:pPr>
       <w:r>
         <w:rPr>
           <w:rFonts w:ascii="Calibri" w:hAnsi="Calibri"/>
           <w:b/>
-          <w:color w:val="000000"/>
-          <w:sz w:val="22"/>
+          <w:sz w:val="19"/>
         </w:rPr>
         <w:t>Project Coordinator</w:t>
       </w:r>
       <w:r>
-        <w:rPr>
-          <w:rFonts w:ascii="Calibri" w:hAnsi="Calibri"/>
-          <w:sz w:val="22"/>
-        </w:rPr>
         <w:tab/>
       </w:r>
       <w:r>
         <w:rPr>
           <w:rFonts w:ascii="Calibri" w:hAnsi="Calibri"/>
-          <w:color w:val="000000"/>
-          <w:sz w:val="22"/>
+          <w:sz w:val="18"/>
         </w:rPr>
         <w:t>July 2020 - Present</w:t>
       </w:r>
     </w:p>
     <w:p>
       <w:pPr>
-        <w:spacing w:before="0" w:after="80" w:line="240" w:lineRule="auto"/>
+        <w:spacing w:after="10"/>
       </w:pPr>
       <w:r>
         <w:rPr>
           <w:rFonts w:ascii="Calibri" w:hAnsi="Calibri"/>
-          <w:b w:val="0"/>
-          <w:color w:val="000000"/>
-          <w:sz w:val="22"/>
+          <w:sz w:val="18"/>
         </w:rPr>
         <w:t>MPH Sales, Inc.</w:t>
       </w:r>
     </w:p>
     <w:p>
       <w:pPr>
-        <w:spacing w:before="0" w:after="40" w:line="240" w:lineRule="auto"/>
-        <w:ind w:left="360" w:hanging="288"/>
+        <w:spacing w:after="10"/>
+        <w:ind w:left="259" w:hanging="216"/>
       </w:pPr>
       <w:r>
         <w:rPr>
           <w:rFonts w:ascii="Calibri" w:hAnsi="Calibri"/>
-          <w:color w:val="000000"/>
-          <w:sz w:val="22"/>
+          <w:sz w:val="18"/>
         </w:rPr>
-        <w:t>• Managed 750+ active accounts across seven states, coordinating project inception, execution, and analysis for software implementations at a $750M corporation, providing logistical oversight, stakeholder alignment, and on-site support.</w:t>
+        <w:t>• Managed 750+ active accounts across seven states, coordinating project inception, execution, and analysis for software implementations at a $750M corporation, providing logistical oversight and stakeholder alignment.</w:t>
       </w:r>
     </w:p>
     <w:p>
       <w:pPr>
-        <w:spacing w:before="0" w:after="40" w:line="240" w:lineRule="auto"/>
-        <w:ind w:left="360" w:hanging="288"/>
+        <w:spacing w:after="10"/>
+        <w:ind w:left="259" w:hanging="216"/>
       </w:pPr>
       <w:r>
         <w:rPr>
           <w:rFonts w:ascii="Calibri" w:hAnsi="Calibri"/>
-          <w:color w:val="000000"/>
-          <w:sz w:val="22"/>
+          <w:sz w:val="18"/>
         </w:rPr>
-        <w:t>• Oversaw timelines, vendor coordination, and budget reconciliation using Microsoft Dynamics, Excel Pivot Tables, and Tableau; conducted post-project reviews to gather feedback, implement improvements, and ensure compliance.</w:t>
+        <w:t>• Oversaw timelines, vendor coordination, and budget reconciliation using Microsoft Dynamics, Excel Pivot Tables, and Tableau; conducted post-project reviews to gather feedback and ensure compliance.</w:t>
       </w:r>
     </w:p>
     <w:p>
       <w:pPr>
-        <w:spacing w:before="0" w:after="120" w:line="240" w:lineRule="auto"/>
-        <w:ind w:left="360" w:hanging="288"/>
+        <w:spacing w:after="10"/>
+        <w:ind w:left="259" w:hanging="216"/>
       </w:pPr>
       <w:r>
         <w:rPr>
           <w:rFonts w:ascii="Calibri" w:hAnsi="Calibri"/>
-          <w:color w:val="000000"/>
-          <w:sz w:val="22"/>
+          <w:sz w:val="18"/>
         </w:rPr>
-        <w:t>• Led website and server migrations (Google Workspace to Microsoft 365) and social initiatives, negotiating specifications and managing changing priorities to deliver within budget as primary contact for executives and teams.</w:t>
+        <w:t>• Led website and server migrations (Google Workspace to Microsoft 365) and social initiatives, negotiating specifications and managing changing priorities as primary contact for executives and teams.</w:t>
       </w:r>
     </w:p>
     <w:p>
       <w:pPr>
-        <w:spacing w:before="80" w:after="0" w:line="240" w:lineRule="auto"/>
         <w:tabs>
-          <w:tab w:val="right" w:pos="10512"/>
+          <w:tab w:pos="10800" w:val="right"/>
         </w:tabs>
+        <w:spacing w:before="60" w:after="0"/>
       </w:pPr>
       <w:r>
         <w:rPr>
           <w:rFonts w:ascii="Calibri" w:hAnsi="Calibri"/>
           <w:b/>
-          <w:color w:val="000000"/>
-          <w:sz w:val="22"/>
+          <w:sz w:val="19"/>
         </w:rPr>
         <w:t>Client Success Manager</w:t>
       </w:r>
       <w:r>
-        <w:rPr>
-          <w:rFonts w:ascii="Calibri" w:hAnsi="Calibri"/>
-          <w:sz w:val="22"/>
-        </w:rPr>
         <w:tab/>
       </w:r>
       <w:r>
         <w:rPr>
           <w:rFonts w:ascii="Calibri" w:hAnsi="Calibri"/>
-          <w:color w:val="000000"/>
-          <w:sz w:val="22"/>
+          <w:sz w:val="18"/>
         </w:rPr>
         <w:t>May 2023 - May 2025</w:t>
       </w:r>
     </w:p>
     <w:p>
       <w:pPr>
-        <w:spacing w:before="0" w:after="80" w:line="240" w:lineRule="auto"/>
+        <w:spacing w:after="10"/>
       </w:pPr>
       <w:r>
         <w:rPr>
           <w:rFonts w:ascii="Calibri" w:hAnsi="Calibri"/>
-          <w:b w:val="0"/>
-          <w:color w:val="000000"/>
-          <w:sz w:val="22"/>
+          <w:sz w:val="18"/>
         </w:rPr>
         <w:t>Red Clay CPAs</w:t>
       </w:r>
     </w:p>
     <w:p>
       <w:pPr>
-        <w:spacing w:before="0" w:after="40" w:line="240" w:lineRule="auto"/>
-        <w:ind w:left="360" w:hanging="288"/>
+        <w:spacing w:after="10"/>
+        <w:ind w:left="259" w:hanging="216"/>
       </w:pPr>
       <w:r>
         <w:rPr>
           <w:rFonts w:ascii="Calibri" w:hAnsi="Calibri"/>
-          <w:color w:val="000000"/>
-          <w:sz w:val="22"/>
+          <w:sz w:val="18"/>
         </w:rPr>
-        <w:t>• Managed client relationships, project milestones, and communications using TaxDome CRM and Google Suite, serving as primary escalation contact to facilitate transparency, enforce policies, and drive retention through excellent service.</w:t>
+        <w:t>• Managed client relationships, project milestones, and communications using TaxDome CRM and Google Suite, serving as primary escalation contact to drive retention through excellent service.</w:t>
       </w:r>
     </w:p>
     <w:p>
       <w:pPr>
-        <w:spacing w:before="0" w:after="40" w:line="240" w:lineRule="auto"/>
-        <w:ind w:left="360" w:hanging="288"/>
+        <w:spacing w:after="10"/>
+        <w:ind w:left="259" w:hanging="216"/>
       </w:pPr>
       <w:r>
         <w:rPr>
           <w:rFonts w:ascii="Calibri" w:hAnsi="Calibri"/>
-          <w:color w:val="000000"/>
-          <w:sz w:val="22"/>
+          <w:sz w:val="18"/>
         </w:rPr>
         <w:t>• Tracked progress, reconciled accounts, and delivered data-driven reports to all management levels, increasing client satisfaction in a high-accountability environment.</w:t>
       </w:r>
     </w:p>
     <w:p>
       <w:pPr>
-        <w:spacing w:before="0" w:after="120" w:line="240" w:lineRule="auto"/>
-        <w:ind w:left="360" w:hanging="288"/>
-      </w:pPr>
-      <w:r>
-        <w:rPr>
-          <w:rFonts w:ascii="Calibri" w:hAnsi="Calibri"/>
-          <w:color w:val="000000"/>
-          <w:sz w:val="22"/>
-        </w:rPr>
-        <w:t>• Coordinated scheduling and actionable insights for client needs, demonstrating strategic judgment and enthusiasm for rising performance standards.</w:t>
-      </w:r>
-    </w:p>
-    <w:p>
-      <w:pPr>
-        <w:spacing w:before="80" w:after="0" w:line="240" w:lineRule="auto"/>
         <w:tabs>
-          <w:tab w:val="right" w:pos="10512"/>
+          <w:tab w:pos="10800" w:val="right"/>
         </w:tabs>
+        <w:spacing w:before="60" w:after="0"/>
       </w:pPr>
       <w:r>
         <w:rPr>
           <w:rFonts w:ascii="Calibri" w:hAnsi="Calibri"/>
           <w:b/>
-          <w:color w:val="000000"/>
-          <w:sz w:val="22"/>
+          <w:sz w:val="19"/>
         </w:rPr>
         <w:t>Digital Media Strategist</w:t>
       </w:r>
       <w:r>
-        <w:rPr>
-          <w:rFonts w:ascii="Calibri" w:hAnsi="Calibri"/>
-          <w:sz w:val="22"/>
-        </w:rPr>
         <w:tab/>
       </w:r>
       <w:r>
         <w:rPr>
           <w:rFonts w:ascii="Calibri" w:hAnsi="Calibri"/>
-          <w:color w:val="000000"/>
-          <w:sz w:val="22"/>
+          <w:sz w:val="18"/>
         </w:rPr>
         <w:t>June 2019 - December 2020</w:t>
       </w:r>
     </w:p>
     <w:p>
       <w:pPr>
-        <w:spacing w:before="0" w:after="80" w:line="240" w:lineRule="auto"/>
+        <w:spacing w:after="10"/>
       </w:pPr>
       <w:r>
         <w:rPr>
           <w:rFonts w:ascii="Calibri" w:hAnsi="Calibri"/>
-          <w:b w:val="0"/>
-          <w:color w:val="000000"/>
-          <w:sz w:val="22"/>
+          <w:sz w:val="18"/>
         </w:rPr>
         <w:t>Roswell City Council</w:t>
       </w:r>
     </w:p>
     <w:p>
       <w:pPr>
-        <w:spacing w:before="0" w:after="40" w:line="240" w:lineRule="auto"/>
-        <w:ind w:left="360" w:hanging="288"/>
+        <w:spacing w:after="10"/>
+        <w:ind w:left="259" w:hanging="216"/>
       </w:pPr>
       <w:r>
         <w:rPr>
           <w:rFonts w:ascii="Calibri" w:hAnsi="Calibri"/>
-          <w:color w:val="000000"/>
-          <w:sz w:val="22"/>
+          <w:sz w:val="18"/>
         </w:rPr>
-        <w:t>• Led campaign strategy and content creation for first-time and incumbent city council candidates; built strong grassroots engagement through digital outreach.</w:t>
+        <w:t>• Led campaign strategy and content creation for city council candidates; developed campaign websites, coordinated social media outreach, and provided actionable digital recommendations to improve engagement.</w:t>
       </w:r>
     </w:p>
     <w:p>
       <w:pPr>
-        <w:spacing w:before="0" w:after="120" w:line="240" w:lineRule="auto"/>
-        <w:ind w:left="360" w:hanging="288"/>
-      </w:pPr>
-      <w:r>
-        <w:rPr>
-          <w:rFonts w:ascii="Calibri" w:hAnsi="Calibri"/>
-          <w:color w:val="000000"/>
-          <w:sz w:val="22"/>
-        </w:rPr>
-        <w:t>• Developed campaign websites, coordinated social media outreach, and provided actionable digital recommendations to improve constituent engagement.</w:t>
-      </w:r>
-    </w:p>
-    <w:p>
-      <w:pPr>
-        <w:spacing w:before="80" w:after="0" w:line="240" w:lineRule="auto"/>
         <w:tabs>
-          <w:tab w:val="right" w:pos="10512"/>
+          <w:tab w:pos="10800" w:val="right"/>
         </w:tabs>
+        <w:spacing w:before="60" w:after="0"/>
       </w:pPr>
       <w:r>
         <w:rPr>
           <w:rFonts w:ascii="Calibri" w:hAnsi="Calibri"/>
           <w:b/>
-          <w:color w:val="000000"/>
-          <w:sz w:val="22"/>
+          <w:sz w:val="19"/>
         </w:rPr>
         <w:t>Owner</w:t>
       </w:r>
       <w:r>
-        <w:rPr>
-          <w:rFonts w:ascii="Calibri" w:hAnsi="Calibri"/>
-          <w:sz w:val="22"/>
-        </w:rPr>
         <w:tab/>
       </w:r>
       <w:r>
         <w:rPr>
           <w:rFonts w:ascii="Calibri" w:hAnsi="Calibri"/>
-          <w:color w:val="000000"/>
-          <w:sz w:val="22"/>
+          <w:sz w:val="18"/>
         </w:rPr>
         <w:t>October 2017 - October 2019</w:t>
       </w:r>
     </w:p>
     <w:p>
       <w:pPr>
-        <w:spacing w:before="0" w:after="80" w:line="240" w:lineRule="auto"/>
+        <w:spacing w:after="10"/>
       </w:pPr>
       <w:r>
         <w:rPr>
           <w:rFonts w:ascii="Calibri" w:hAnsi="Calibri"/>
-          <w:b w:val="0"/>
-          <w:color w:val="000000"/>
-          <w:sz w:val="22"/>
+          <w:sz w:val="18"/>
         </w:rPr>
         <w:t>Jack Hagler Services, LLC.</w:t>
       </w:r>
     </w:p>
     <w:p>
       <w:pPr>
-        <w:spacing w:before="0" w:after="40" w:line="240" w:lineRule="auto"/>
-        <w:ind w:left="360" w:hanging="288"/>
+        <w:spacing w:after="10"/>
+        <w:ind w:left="259" w:hanging="216"/>
       </w:pPr>
       <w:r>
         <w:rPr>
           <w:rFonts w:ascii="Calibri" w:hAnsi="Calibri"/>
-          <w:color w:val="000000"/>
-          <w:sz w:val="22"/>
+          <w:sz w:val="18"/>
         </w:rPr>
         <w:t>• Founded and scaled home services business to $50K annual sales, coordinating client scheduling, online payments, and vendor relationships while reconciling expenses and maintaining compliance.</w:t>
       </w:r>
     </w:p>
     <w:p>
       <w:pPr>
-        <w:spacing w:before="0" w:after="120" w:line="240" w:lineRule="auto"/>
-        <w:ind w:left="360" w:hanging="288"/>
-      </w:pPr>
-      <w:r>
-        <w:rPr>
-          <w:rFonts w:ascii="Calibri" w:hAnsi="Calibri"/>
-          <w:color w:val="000000"/>
-          <w:sz w:val="22"/>
-        </w:rPr>
-        <w:t>• Oversaw small-project logistics from planning to execution, negotiating contracts and ensuring timely, budget-conscious delivery as sole point of contact.</w:t>
-      </w:r>
-    </w:p>
-    <w:p>
-      <w:pPr>
-        <w:spacing w:before="80" w:after="0" w:line="240" w:lineRule="auto"/>
         <w:tabs>
-          <w:tab w:val="right" w:pos="10512"/>
+          <w:tab w:pos="10800" w:val="right"/>
         </w:tabs>
+        <w:spacing w:before="60" w:after="0"/>
       </w:pPr>
       <w:r>
         <w:rPr>
           <w:rFonts w:ascii="Calibri" w:hAnsi="Calibri"/>
           <w:b/>
-          <w:color w:val="000000"/>
-          <w:sz w:val="22"/>
+          <w:sz w:val="19"/>
         </w:rPr>
         <w:t>Distribution and Logistics Consultant</w:t>
       </w:r>
       <w:r>
-        <w:rPr>
-          <w:rFonts w:ascii="Calibri" w:hAnsi="Calibri"/>
-          <w:sz w:val="22"/>
-        </w:rPr>
         <w:tab/>
       </w:r>
       <w:r>
         <w:rPr>
           <w:rFonts w:ascii="Calibri" w:hAnsi="Calibri"/>
-          <w:color w:val="000000"/>
-          <w:sz w:val="22"/>
+          <w:sz w:val="18"/>
         </w:rPr>
         <w:t>October 2015 - October 2017</w:t>
       </w:r>
     </w:p>
     <w:p>
       <w:pPr>
-        <w:spacing w:before="0" w:after="80" w:line="240" w:lineRule="auto"/>
+        <w:spacing w:after="10"/>
       </w:pPr>
       <w:r>
         <w:rPr>
           <w:rFonts w:ascii="Calibri" w:hAnsi="Calibri"/>
-          <w:b w:val="0"/>
-          <w:color w:val="000000"/>
-          <w:sz w:val="22"/>
+          <w:sz w:val="18"/>
         </w:rPr>
         <w:t>Sebia USA, Norcross, GA</w:t>
       </w:r>
     </w:p>
     <w:p>
       <w:pPr>
-        <w:spacing w:before="0" w:after="40" w:line="240" w:lineRule="auto"/>
-        <w:ind w:left="360" w:hanging="288"/>
+        <w:spacing w:after="10"/>
+        <w:ind w:left="259" w:hanging="216"/>
       </w:pPr>
       <w:r>
         <w:rPr>
           <w:rFonts w:ascii="Calibri" w:hAnsi="Calibri"/>
-          <w:color w:val="000000"/>
-          <w:sz w:val="22"/>
+          <w:sz w:val="18"/>
         </w:rPr>
-        <w:t>• Utilized UPS WorldShip and integrated shipping platforms to manage and streamline domestic and international distribution of medical diagnostic equipment for the $75 million United States headquarters.</w:t>
+        <w:t>• Managed domestic and international distribution of medical diagnostic equipment using UPS WorldShip for the $75 million U.S. headquarters; spearheaded 15,000 sq. ft. warehouse expansion planning.</w:t>
       </w:r>
     </w:p>
     <w:p>
       <w:pPr>
-        <w:spacing w:before="0" w:after="40" w:line="240" w:lineRule="auto"/>
-        <w:ind w:left="360" w:hanging="288"/>
+        <w:spacing w:after="10"/>
+        <w:ind w:left="259" w:hanging="216"/>
       </w:pPr>
       <w:r>
         <w:rPr>
           <w:rFonts w:ascii="Calibri" w:hAnsi="Calibri"/>
-          <w:color w:val="000000"/>
-          <w:sz w:val="22"/>
-        </w:rPr>
-        <w:t>• Spearheaded the expansion and renovation planning of 15,000 sq. ft. warehouse, improving layout efficiency, storage capacity, and operational flow.</w:t>
-      </w:r>
-    </w:p>
-    <w:p>
-      <w:pPr>
-        <w:spacing w:before="0" w:after="120" w:line="240" w:lineRule="auto"/>
-        <w:ind w:left="360" w:hanging="288"/>
-      </w:pPr>
-      <w:r>
-        <w:rPr>
-          <w:rFonts w:ascii="Calibri" w:hAnsi="Calibri"/>
-          <w:color w:val="000000"/>
-          <w:sz w:val="22"/>
+          <w:sz w:val="18"/>
         </w:rPr>
         <w:t>• Implemented Lean Six Sigma methodologies to optimize warehouse operations, reducing waste, improving inventory accuracy, and increasing overall process efficiency.</w:t>
       </w:r>
     </w:p>
     <w:p>
       <w:pPr>
-        <w:spacing w:before="160" w:after="80" w:line="240" w:lineRule="auto"/>
-        <w:jc w:val="left"/>
+        <w:spacing w:before="80" w:after="20"/>
         <w:pBdr>
           <w:bottom w:val="single" w:sz="4" w:space="1" w:color="000000"/>
         </w:pBdr>
@@ -507,102 +392,90 @@
         <w:rPr>
           <w:rFonts w:ascii="Calibri" w:hAnsi="Calibri"/>
           <w:b/>
-          <w:color w:val="000000"/>
-          <w:sz w:val="26"/>
+          <w:sz w:val="21"/>
         </w:rPr>
         <w:t>EDUCATION</w:t>
       </w:r>
     </w:p>
     <w:p>
       <w:pPr>
-        <w:spacing w:before="80" w:after="0" w:line="240" w:lineRule="auto"/>
-        <w:jc w:val="left"/>
+        <w:spacing w:before="40" w:after="0"/>
       </w:pPr>
       <w:r>
         <w:rPr>
           <w:rFonts w:ascii="Calibri" w:hAnsi="Calibri"/>
           <w:b/>
-          <w:color w:val="000000"/>
-          <w:sz w:val="22"/>
+          <w:sz w:val="18"/>
         </w:rPr>
         <w:t>Bachelor of Science in Public Relations, 2020</w:t>
       </w:r>
     </w:p>
     <w:p>
       <w:pPr>
-        <w:spacing w:before="0" w:after="80" w:line="240" w:lineRule="auto"/>
+        <w:spacing w:after="10"/>
       </w:pPr>
       <w:r>
         <w:rPr>
           <w:rFonts w:ascii="Calibri" w:hAnsi="Calibri"/>
-          <w:b w:val="0"/>
-          <w:color w:val="000000"/>
-          <w:sz w:val="22"/>
+          <w:sz w:val="18"/>
         </w:rPr>
         <w:t>Kennesaw State University</w:t>
       </w:r>
     </w:p>
     <w:p>
       <w:pPr>
-        <w:spacing w:before="0" w:after="120" w:line="240" w:lineRule="auto"/>
-        <w:ind w:left="360" w:hanging="288"/>
+        <w:spacing w:after="10"/>
+        <w:ind w:left="259" w:hanging="216"/>
       </w:pPr>
       <w:r>
         <w:rPr>
           <w:rFonts w:ascii="Calibri" w:hAnsi="Calibri"/>
-          <w:color w:val="000000"/>
-          <w:sz w:val="22"/>
+          <w:sz w:val="18"/>
         </w:rPr>
         <w:t>• Published Researcher and Co-Author, National Conference of Undergraduate Research (NCUR) 2019</w:t>
       </w:r>
     </w:p>
     <w:p>
       <w:pPr>
-        <w:spacing w:before="80" w:after="0" w:line="240" w:lineRule="auto"/>
-        <w:jc w:val="left"/>
+        <w:spacing w:before="40" w:after="0"/>
       </w:pPr>
       <w:r>
         <w:rPr>
           <w:rFonts w:ascii="Calibri" w:hAnsi="Calibri"/>
           <w:b/>
-          <w:color w:val="000000"/>
-          <w:sz w:val="22"/>
+          <w:sz w:val="18"/>
         </w:rPr>
         <w:t>Public Relations, 2015 - 2017</w:t>
       </w:r>
     </w:p>
     <w:p>
       <w:pPr>
-        <w:spacing w:before="0" w:after="80" w:line="240" w:lineRule="auto"/>
+        <w:spacing w:after="10"/>
       </w:pPr>
       <w:r>
         <w:rPr>
           <w:rFonts w:ascii="Calibri" w:hAnsi="Calibri"/>
-          <w:b w:val="0"/>
-          <w:color w:val="000000"/>
-          <w:sz w:val="22"/>
+          <w:sz w:val="18"/>
         </w:rPr>
         <w:t>Georgia Southern University</w:t>
       </w:r>
     </w:p>
     <w:p>
       <w:pPr>
-        <w:spacing w:before="0" w:after="120" w:line="240" w:lineRule="auto"/>
-        <w:ind w:left="360" w:hanging="288"/>
+        <w:spacing w:after="10"/>
+        <w:ind w:left="259" w:hanging="216"/>
       </w:pPr>
       <w:r>
         <w:rPr>
           <w:rFonts w:ascii="Calibri" w:hAnsi="Calibri"/>
-          <w:color w:val="000000"/>
-          <w:sz w:val="22"/>
+          <w:sz w:val="18"/>
         </w:rPr>
         <w:t>• Re-Founding Father, Phi Delta Theta (Executive Officer, Scholarship Chairman)</w:t>
       </w:r>
     </w:p>
     <w:p>
       <w:pPr>
-        <w:spacing w:before="160" w:after="80" w:line="240" w:lineRule="auto"/>
-        <w:jc w:val="left"/>
+        <w:spacing w:before="80" w:after="20"/>
         <w:pBdr>
           <w:bottom w:val="single" w:sz="4" w:space="1" w:color="000000"/>
         </w:pBdr>
@@ -611,128 +484,118 @@
         <w:rPr>
           <w:rFonts w:ascii="Calibri" w:hAnsi="Calibri"/>
           <w:b/>
-          <w:color w:val="000000"/>
-          <w:sz w:val="26"/>
+          <w:sz w:val="21"/>
         </w:rPr>
         <w:t>CERTIFICATIONS</w:t>
       </w:r>
     </w:p>
     <w:p>
       <w:pPr>
-        <w:spacing w:before="0" w:after="40" w:line="240" w:lineRule="auto"/>
-        <w:ind w:left="360" w:hanging="288"/>
+        <w:spacing w:after="0"/>
+        <w:ind w:left="259" w:hanging="216"/>
       </w:pPr>
       <w:r>
         <w:rPr>
           <w:rFonts w:ascii="Calibri" w:hAnsi="Calibri"/>
-          <w:color w:val="000000"/>
-          <w:sz w:val="22"/>
+          <w:sz w:val="17"/>
         </w:rPr>
         <w:t>• Project Management Professional Certificate - Google</w:t>
       </w:r>
     </w:p>
     <w:p>
       <w:pPr>
-        <w:spacing w:before="0" w:after="40" w:line="240" w:lineRule="auto"/>
-        <w:ind w:left="360" w:hanging="288"/>
+        <w:spacing w:after="0"/>
+        <w:ind w:left="259" w:hanging="216"/>
       </w:pPr>
       <w:r>
         <w:rPr>
           <w:rFonts w:ascii="Calibri" w:hAnsi="Calibri"/>
-          <w:color w:val="000000"/>
-          <w:sz w:val="22"/>
+          <w:sz w:val="17"/>
         </w:rPr>
         <w:t>• Google and Gies College of Business Dual Credential - Google and UIUC</w:t>
       </w:r>
     </w:p>
     <w:p>
       <w:pPr>
-        <w:spacing w:before="0" w:after="40" w:line="240" w:lineRule="auto"/>
-        <w:ind w:left="360" w:hanging="288"/>
+        <w:spacing w:after="0"/>
+        <w:ind w:left="259" w:hanging="216"/>
       </w:pPr>
       <w:r>
         <w:rPr>
           <w:rFonts w:ascii="Calibri" w:hAnsi="Calibri"/>
-          <w:color w:val="000000"/>
-          <w:sz w:val="22"/>
+          <w:sz w:val="17"/>
         </w:rPr>
         <w:t>• Customer Engagement Fundamentals - IBM</w:t>
       </w:r>
     </w:p>
     <w:p>
       <w:pPr>
-        <w:spacing w:before="0" w:after="40" w:line="240" w:lineRule="auto"/>
-        <w:ind w:left="360" w:hanging="288"/>
+        <w:spacing w:after="0"/>
+        <w:ind w:left="259" w:hanging="216"/>
       </w:pPr>
       <w:r>
         <w:rPr>
           <w:rFonts w:ascii="Calibri" w:hAnsi="Calibri"/>
-          <w:color w:val="000000"/>
-          <w:sz w:val="22"/>
+          <w:sz w:val="17"/>
         </w:rPr>
         <w:t>• Global Challenges in Business Specialization - University of Illinois at Urbana-Champaign (UIUC)</w:t>
       </w:r>
     </w:p>
     <w:p>
       <w:pPr>
-        <w:spacing w:before="0" w:after="40" w:line="240" w:lineRule="auto"/>
-        <w:ind w:left="360" w:hanging="288"/>
+        <w:spacing w:after="0"/>
+        <w:ind w:left="259" w:hanging="216"/>
       </w:pPr>
       <w:r>
         <w:rPr>
           <w:rFonts w:ascii="Calibri" w:hAnsi="Calibri"/>
-          <w:color w:val="000000"/>
-          <w:sz w:val="22"/>
+          <w:sz w:val="17"/>
         </w:rPr>
         <w:t>• Innovation: From Creativity to Entrepreneurship Specialization - UIUC</w:t>
       </w:r>
     </w:p>
     <w:p>
       <w:pPr>
-        <w:spacing w:before="0" w:after="40" w:line="240" w:lineRule="auto"/>
-        <w:ind w:left="360" w:hanging="288"/>
+        <w:spacing w:after="0"/>
+        <w:ind w:left="259" w:hanging="216"/>
       </w:pPr>
       <w:r>
         <w:rPr>
           <w:rFonts w:ascii="Calibri" w:hAnsi="Calibri"/>
-          <w:color w:val="000000"/>
-          <w:sz w:val="22"/>
+          <w:sz w:val="17"/>
         </w:rPr>
         <w:t>• Microsoft 365 Fundamentals Specialization - Microsoft</w:t>
       </w:r>
     </w:p>
     <w:p>
       <w:pPr>
-        <w:spacing w:before="0" w:after="40" w:line="240" w:lineRule="auto"/>
-        <w:ind w:left="360" w:hanging="288"/>
+        <w:spacing w:after="0"/>
+        <w:ind w:left="259" w:hanging="216"/>
       </w:pPr>
       <w:r>
         <w:rPr>
           <w:rFonts w:ascii="Calibri" w:hAnsi="Calibri"/>
-          <w:color w:val="000000"/>
-          <w:sz w:val="22"/>
+          <w:sz w:val="17"/>
         </w:rPr>
         <w:t>• Customer Service Professional Certificate - Zendesk</w:t>
       </w:r>
     </w:p>
     <w:p>
       <w:pPr>
-        <w:spacing w:before="0" w:after="120" w:line="240" w:lineRule="auto"/>
-        <w:ind w:left="360" w:hanging="288"/>
+        <w:spacing w:after="0"/>
+        <w:ind w:left="259" w:hanging="216"/>
       </w:pPr>
       <w:r>
         <w:rPr>
           <w:rFonts w:ascii="Calibri" w:hAnsi="Calibri"/>
-          <w:color w:val="000000"/>
-          <w:sz w:val="22"/>
+          <w:sz w:val="17"/>
         </w:rPr>
         <w:t>• Supply Chain Foundations: CRM (Customer Relationship Management) Professional Certificate - CSCMP</w:t>
       </w:r>
     </w:p>
     <w:p>
       <w:pPr>
-        <w:spacing w:before="160" w:after="80" w:line="240" w:lineRule="auto"/>
-        <w:jc w:val="left"/>
+        <w:spacing w:before="80" w:after="20"/>
         <w:pBdr>
           <w:bottom w:val="single" w:sz="4" w:space="1" w:color="000000"/>
         </w:pBdr>
@@ -741,32 +604,29 @@
         <w:rPr>
           <w:rFonts w:ascii="Calibri" w:hAnsi="Calibri"/>
           <w:b/>
-          <w:color w:val="000000"/>
-          <w:sz w:val="26"/>
+          <w:sz w:val="21"/>
         </w:rPr>
         <w:t>SKILLS</w:t>
       </w:r>
     </w:p>
     <w:p>
       <w:pPr>
-        <w:spacing w:before="0" w:after="120" w:line="240" w:lineRule="auto"/>
-        <w:jc w:val="left"/>
+        <w:spacing w:after="0"/>
       </w:pPr>
       <w:r>
         <w:rPr>
           <w:rFonts w:ascii="Calibri" w:hAnsi="Calibri"/>
           <w:b w:val="0"/>
-          <w:color w:val="000000"/>
-          <w:sz w:val="22"/>
+          <w:sz w:val="17"/>
         </w:rPr>
-        <w:t>Project Management, Client Relationship Management (CRM), Stakeholder Communication, Cross-Functional Collaboration, Vendor Coordination, Budget Reconciliation, Data Analysis, Data Visualization, Microsoft Dynamics, Tableau, Excel Pivot Tables, Microsoft 365, Google Workspace, TaxDome, Change Management, Digital Transformation, Cloud Migration, Financial Management, Lean Six Sigma, AI Literacy, Predictive Analytics</w:t>
+        <w:t>Project Management, CRM (Customer Relationship Management), Stakeholder Communication, Cross-Functional Collaboration, Vendor Coordination, Budget Reconciliation, Data Analysis, Data Visualization, Microsoft Dynamics, Tableau, Excel Pivot Tables, Microsoft 365, Google Workspace, TaxDome, Change Management, Digital Transformation, Lean Six Sigma, AI Literacy</w:t>
       </w:r>
     </w:p>
     <w:sectPr>
       <w:headerReference w:type="default" r:id="rId9"/>
       <w:footerReference w:type="default" r:id="rId10"/>
       <w:pgSz w:w="12240" w:h="15840"/>
-      <w:pgMar w:top="864" w:right="864" w:bottom="864" w:left="864" w:header="720" w:footer="720" w:gutter="0"/>
+      <w:pgMar w:top="576" w:right="720" w:bottom="432" w:left="720" w:header="720" w:footer="720" w:gutter="0"/>
       <w:cols w:space="720"/>
       <w:docGrid w:linePitch="360"/>
     </w:sectPr>
@@ -780,6 +640,7 @@
     <w:pPr>
       <w:pStyle w:val="Footer"/>
     </w:pPr>
+    <w:r/>
   </w:p>
 </w:ftr>
 </file>
@@ -790,6 +651,7 @@
     <w:pPr>
       <w:pStyle w:val="Header"/>
     </w:pPr>
+    <w:r/>
   </w:p>
 </w:hdr>
 </file>
@@ -1158,12 +1020,12 @@
     <w:qFormat/>
     <w:rsid w:val="00FC693F"/>
     <w:pPr>
-      <w:spacing w:before="0" w:after="40" w:line="240" w:lineRule="auto"/>
+      <w:spacing w:before="0" w:after="0" w:line="240" w:lineRule="auto"/>
     </w:pPr>
     <w:rPr>
       <w:rFonts w:ascii="Calibri" w:hAnsi="Calibri"/>
       <w:color w:val="000000"/>
-      <w:sz w:val="22"/>
+      <w:sz w:val="20"/>
     </w:rPr>
   </w:style>
   <w:style w:type="paragraph" w:styleId="Header">

</xml_diff>

<commit_message>
Remove Georgia Southern from resume, restore trimmed bullets
</commit_message>
<xml_diff>
--- a/Resume-Jack-Hagler-ATS.docx
+++ b/Resume-Jack-Hagler-ATS.docx
@@ -52,7 +52,6 @@
       <w:r>
         <w:rPr>
           <w:rFonts w:ascii="Calibri" w:hAnsi="Calibri"/>
-          <w:b w:val="0"/>
           <w:sz w:val="18"/>
         </w:rPr>
         <w:t>Results-driven Project Coordinator with 5+ years managing 750+ accounts across seven states for a $750M corporation. Proven expertise in project management, CRM operations (Microsoft Dynamics, TaxDome), data analysis (Tableau, Excel Pivot Tables), and cross-functional stakeholder communication. Skilled in vendor coordination, budget reconciliation, digital transformation, and client success management.</w:t>
@@ -217,6 +216,19 @@
     </w:p>
     <w:p>
       <w:pPr>
+        <w:spacing w:after="10"/>
+        <w:ind w:left="259" w:hanging="216"/>
+      </w:pPr>
+      <w:r>
+        <w:rPr>
+          <w:rFonts w:ascii="Calibri" w:hAnsi="Calibri"/>
+          <w:sz w:val="18"/>
+        </w:rPr>
+        <w:t>• Coordinated scheduling and actionable insights for client needs, demonstrating strategic judgment and enthusiasm for rising performance standards.</w:t>
+      </w:r>
+    </w:p>
+    <w:p>
+      <w:pPr>
         <w:tabs>
           <w:tab w:pos="10800" w:val="right"/>
         </w:tabs>
@@ -315,6 +327,19 @@
           <w:sz w:val="18"/>
         </w:rPr>
         <w:t>• Founded and scaled home services business to $50K annual sales, coordinating client scheduling, online payments, and vendor relationships while reconciling expenses and maintaining compliance.</w:t>
+      </w:r>
+    </w:p>
+    <w:p>
+      <w:pPr>
+        <w:spacing w:after="10"/>
+        <w:ind w:left="259" w:hanging="216"/>
+      </w:pPr>
+      <w:r>
+        <w:rPr>
+          <w:rFonts w:ascii="Calibri" w:hAnsi="Calibri"/>
+          <w:sz w:val="18"/>
+        </w:rPr>
+        <w:t>• Oversaw small-project logistics from planning to execution, negotiating contracts and ensuring timely, budget-conscious delivery as sole point of contact.</w:t>
       </w:r>
     </w:p>
     <w:p>
@@ -433,44 +458,6 @@
           <w:sz w:val="18"/>
         </w:rPr>
         <w:t>• Published Researcher and Co-Author, National Conference of Undergraduate Research (NCUR) 2019</w:t>
-      </w:r>
-    </w:p>
-    <w:p>
-      <w:pPr>
-        <w:spacing w:before="40" w:after="0"/>
-      </w:pPr>
-      <w:r>
-        <w:rPr>
-          <w:rFonts w:ascii="Calibri" w:hAnsi="Calibri"/>
-          <w:b/>
-          <w:sz w:val="18"/>
-        </w:rPr>
-        <w:t>Public Relations, 2015 - 2017</w:t>
-      </w:r>
-    </w:p>
-    <w:p>
-      <w:pPr>
-        <w:spacing w:after="10"/>
-      </w:pPr>
-      <w:r>
-        <w:rPr>
-          <w:rFonts w:ascii="Calibri" w:hAnsi="Calibri"/>
-          <w:sz w:val="18"/>
-        </w:rPr>
-        <w:t>Georgia Southern University</w:t>
-      </w:r>
-    </w:p>
-    <w:p>
-      <w:pPr>
-        <w:spacing w:after="10"/>
-        <w:ind w:left="259" w:hanging="216"/>
-      </w:pPr>
-      <w:r>
-        <w:rPr>
-          <w:rFonts w:ascii="Calibri" w:hAnsi="Calibri"/>
-          <w:sz w:val="18"/>
-        </w:rPr>
-        <w:t>• Re-Founding Father, Phi Delta Theta (Executive Officer, Scholarship Chairman)</w:t>
       </w:r>
     </w:p>
     <w:p>
@@ -616,7 +603,6 @@
       <w:r>
         <w:rPr>
           <w:rFonts w:ascii="Calibri" w:hAnsi="Calibri"/>
-          <w:b w:val="0"/>
           <w:sz w:val="17"/>
         </w:rPr>
         <w:t>Project Management, CRM (Customer Relationship Management), Stakeholder Communication, Cross-Functional Collaboration, Vendor Coordination, Budget Reconciliation, Data Analysis, Data Visualization, Microsoft Dynamics, Tableau, Excel Pivot Tables, Microsoft 365, Google Workspace, TaxDome, Change Management, Digital Transformation, Lean Six Sigma, AI Literacy</w:t>

</xml_diff>